<commit_message>
Enrich music-curriculum report with verified research details
- Note that the 2024 amendment (Dz.U. 2024 poz. 996) did not change the
  Muzyka core curriculum; requirements remain in force (current as of 2026).
- Add the five forms of musical activity, with singing as the primary form;
  note ~30 mandatory hours/year.
- Add historical anthems present in ZPE resources (Bogurodzica, Gaude Mater
  Polonia) to the report and the repertoire pack.

Co-Authored-By: Claude Opus 4.8 <noreply@anthropic.com>
Claude-Session: https://claude.ai/code/session_01WrWnzjDS4gKGgSt3A294G4
</commit_message>
<xml_diff>
--- a/edukacja-muzyczna-szkola-podstawowa/materialy/Repertuar-i-materialy.docx
+++ b/edukacja-muzyczna-szkola-podstawowa/materialy/Repertuar-i-materialy.docx
@@ -584,6 +584,44 @@
     </w:p>
     <w:p>
       <w:pPr>
+        <w:spacing w:after="100"/>
+      </w:pPr>
+      <w:r>
+        <w:rPr>
+          <w:b/>
+          <w:bCs/>
+        </w:rPr>
+        <w:t xml:space="preserve">Pieśni historyczne (obecne w zasobach ZPE, na uroczystości)</w:t>
+      </w:r>
+    </w:p>
+    <w:p>
+      <w:pPr>
+        <w:pStyle w:val="ListParagraph"/>
+        <w:numPr>
+          <w:ilvl w:val="0"/>
+          <w:numId w:val="1"/>
+        </w:numPr>
+        <w:spacing w:after="40"/>
+      </w:pPr>
+      <w:r>
+        <w:t xml:space="preserve">„Bogurodzica" (najstarsza polska pieśń religijno-patriotyczna)</w:t>
+      </w:r>
+    </w:p>
+    <w:p>
+      <w:pPr>
+        <w:pStyle w:val="ListParagraph"/>
+        <w:numPr>
+          <w:ilvl w:val="0"/>
+          <w:numId w:val="1"/>
+        </w:numPr>
+        <w:spacing w:after="40"/>
+      </w:pPr>
+      <w:r>
+        <w:t xml:space="preserve">„Gaude Mater Polonia" (hymn na uroczystości, np. rozpoczęcie roku)</w:t>
+      </w:r>
+    </w:p>
+    <w:p>
+      <w:pPr>
         <w:pBdr>
           <w:left w:val="single" w:color="2E75B6" w:sz="18" w:space="8"/>
         </w:pBdr>

</xml_diff>